<commit_message>
Extinde generare DOCX oferte: modal cu detalii tehnice + fix placeholders
- OfertaModal: adaugă secțiuni condiționale per tip ofertă (faza proiectare,
  tip cladire, regim inaltime, material structura, suprafata, structura propusa,
  tip interventie, scop expertiza, cod LMI, categorie monument, grafic plata T1/T2/T3)
- Generate route: rescrie processOfertaPlaceholders cu suport complet pentru
  Beneficiar/Denumire inline, Faza, Tipul cladirii — Adresa/Localitate,
  sectiunea 1.1 descriere, Structura propusa, grafic plata %%, consolidari patterns
- API route: adaugă coloana detalii_tehnice (JSON string) in POST/PUT
- Consolidari template: resetat la placeholder patterns (____/____, ___ EUR+TVA,
  ___ zile, Beneficiar: Denumire, DALI/PT+DE, Se completeaza)
- Script ALTER TABLE: scripts/oferte-add-detalii-tehnice.sql

Co-Authored-By: Claude Opus 4.6 (1M context) <noreply@anthropic.com>
</commit_message>
<xml_diff>
--- a/uploads/oferte/templates/Oferta_Consolidari.docx
+++ b/uploads/oferte/templates/Oferta_Consolidari.docx
@@ -148,7 +148,7 @@
                 <w:sz w:val="18"/>
                 <w:szCs w:val="18"/>
               </w:rPr>
-              <w:t>Număr înregistrare:204/12.03.2026</w:t>
+              <w:t>Număr înregistrare:____/____</w:t>
             </w:r>
             <w:r>
               <w:rPr>
@@ -218,25 +218,6 @@
           <w:szCs w:val="22"/>
         </w:rPr>
         <w:t>Tipul clădirii — Adresă/Localitate</w:t>
-      </w:r>
-      <w:r>
-        <w:rPr>
-          <w:color w:val="555555"/>
-          <w:sz w:val="22"/>
-          <w:szCs w:val="22"/>
-        </w:rPr>
-        <w:t>-</w:t>
-      </w:r>
-      <w:r>
-        <w:t xml:space="preserve"> </w:t>
-      </w:r>
-      <w:r>
-        <w:rPr>
-          <w:color w:val="555555"/>
-          <w:sz w:val="22"/>
-          <w:szCs w:val="22"/>
-        </w:rPr>
-        <w:t>Aeroportul International Bucuresti-Baneasa</w:t>
       </w:r>
     </w:p>
     <w:p>
@@ -259,7 +240,7 @@
           <w:sz w:val="20"/>
           <w:szCs w:val="20"/>
         </w:rPr>
-        <w:t>Faza: DALI</w:t>
+        <w:t>Faza: DALI / PT+DE / DALI+PT+DE</w:t>
       </w:r>
     </w:p>
     <w:p>
@@ -275,17 +256,7 @@
           <w:sz w:val="20"/>
           <w:szCs w:val="20"/>
         </w:rPr>
-        <w:t xml:space="preserve"> Beneficiar: </w:t>
-      </w:r>
-      <w:r>
-        <w:rPr>
-          <w:i/>
-          <w:iCs/>
-          <w:color w:val="555555"/>
-          <w:sz w:val="20"/>
-          <w:szCs w:val="20"/>
-        </w:rPr>
-        <w:t>Aeroportul International Bucuresti-Baneasa</w:t>
+        <w:t xml:space="preserve"> Beneficiar: Denumire</w:t>
       </w:r>
     </w:p>
     <w:p>
@@ -324,13 +295,7 @@
     </w:p>
     <w:p>
       <w:r>
-        <w:t>C</w:t>
-      </w:r>
-      <w:r>
-        <w:t xml:space="preserve">onsolidare, </w:t>
-      </w:r>
-      <w:r>
-        <w:t>Gard 300 ml, aproximativ 200 ml beton, aproximativ 100 ml plasa bordurata, anul executiei 1985.</w:t>
+        <w:t>Se completeaza cu descrierea interventiei propuse.</w:t>
       </w:r>
     </w:p>
     <w:p>
@@ -415,12 +380,12 @@
                 <w:sz w:val="22"/>
                 <w:szCs w:val="22"/>
               </w:rPr>
-              <w:t>Consolidare</w:t>
-            </w:r>
-          </w:p>
-          <w:p>
-            <w:r>
-              <w:t>Gard 300 ml, aproximativ 200 ml beton, aproximativ 100 ml plasa bordurata, anul executiei 1985.</w:t>
+              <w:t>[Se completeaza cu tipul interventiei]</w:t>
+            </w:r>
+          </w:p>
+          <w:p>
+            <w:r>
+              <w:t>Se completeaza cu descrierea interventiei propuse.</w:t>
             </w:r>
           </w:p>
           <w:p>
@@ -1078,7 +1043,7 @@
               <w:spacing w:before="80" w:after="80"/>
             </w:pPr>
             <w:r>
-              <w:t>Proiect rezistență consolidare DALI</w:t>
+              <w:t>Proiect rezistență consolidare DALI / PT+DE / DALI+PT+DE</w:t>
             </w:r>
           </w:p>
         </w:tc>
@@ -1164,7 +1129,7 @@
               <w:spacing w:before="80" w:after="80"/>
             </w:pPr>
             <w:r>
-              <w:t>2454</w:t>
+              <w:t>___________</w:t>
             </w:r>
             <w:bookmarkStart w:id="0" w:name="_GoBack"/>
             <w:bookmarkEnd w:id="0"/>
@@ -1258,7 +1223,7 @@
               <w:spacing w:before="80" w:after="80"/>
             </w:pPr>
             <w:r>
-              <w:t>30</w:t>
+              <w:t>___</w:t>
             </w:r>
             <w:r>
               <w:t xml:space="preserve"> zile lucrătoare de la semnarea contractului și primirea tuturor datelor de intrare</w:t>

</xml_diff>

<commit_message>
Fix generare DOCX oferte: detalii_tehnice JSON parsing + template fixes
- Fix bug critic: detalii_tehnice JSON era XML-escaped înainte de JSON.parse(),
  rezultând în pierderea tuturor datelor tehnice (faza, structura propusa, etc.)
- Fix consolidari template: merge split runs pentru preț/termen (erau în
  <w:t> separate), elimină descriere duplicată sub Tipul intervenției
- Fix regex faza financiara consolidari: match pattern complet
  DALI / PT+DE / DALI+PT+DE, nu doar DALI
- Fix descriere duplicată: prima instanță → proiect_descriere,
  sub Tipul intervenției → tip_interventie
- Update toate template-urile: "6 ingineri structuriști" → "peste 8 ingineri"

Co-Authored-By: Claude Opus 4.6 (1M context) <noreply@anthropic.com>
</commit_message>
<xml_diff>
--- a/uploads/oferte/templates/Oferta_Consolidari.docx
+++ b/uploads/oferte/templates/Oferta_Consolidari.docx
@@ -384,11 +384,6 @@
             </w:r>
           </w:p>
           <w:p>
-            <w:r>
-              <w:t>Se completeaza cu descrierea interventiei propuse.</w:t>
-            </w:r>
-          </w:p>
-          <w:p>
             <w:pPr>
               <w:spacing w:before="80" w:after="80"/>
             </w:pPr>
@@ -1129,15 +1124,7 @@
               <w:spacing w:before="80" w:after="80"/>
             </w:pPr>
             <w:r>
-              <w:t>___________</w:t>
-            </w:r>
-            <w:bookmarkStart w:id="0" w:name="_GoBack"/>
-            <w:bookmarkEnd w:id="0"/>
-            <w:r>
-              <w:t xml:space="preserve"> EUR</w:t>
-            </w:r>
-            <w:r>
-              <w:t xml:space="preserve"> + TVA</w:t>
+              <w:t>___________ EUR + TVA</w:t>
             </w:r>
           </w:p>
         </w:tc>
@@ -1223,10 +1210,7 @@
               <w:spacing w:before="80" w:after="80"/>
             </w:pPr>
             <w:r>
-              <w:t>___</w:t>
-            </w:r>
-            <w:r>
-              <w:t xml:space="preserve"> zile lucrătoare de la semnarea contractului și primirea tuturor datelor de intrare</w:t>
+              <w:t>___ zile lucrătoare de la semnarea contractului și primirea tuturor datelor de intrare</w:t>
             </w:r>
           </w:p>
         </w:tc>
@@ -2855,7 +2839,7 @@
                 <w:sz w:val="22"/>
                 <w:szCs w:val="22"/>
               </w:rPr>
-              <w:t>Echipă formată și stabilă de 6 ingineri structuriști</w:t>
+              <w:t>Echipă formată și stabilă cu peste 8 ingineri structuriști</w:t>
             </w:r>
           </w:p>
           <w:p>

</xml_diff>